<commit_message>
Clarify WRRA-M 0.5 information-load scope and start 0.6 load/twist/expansion prototype
</commit_message>
<xml_diff>
--- a/paper/WRRA_M_0_5_EN.docx
+++ b/paper/WRRA_M_0_5_EN.docx
@@ -2,7 +2,7 @@
 <file path=word/document.xml><?xml version="1.0" encoding="utf-8"?>
 <w:document xmlns:w="http://schemas.openxmlformats.org/wordprocessingml/2006/main" xmlns:m="http://schemas.openxmlformats.org/officeDocument/2006/math" xmlns:r="http://schemas.openxmlformats.org/officeDocument/2006/relationships" xmlns:o="urn:schemas-microsoft-com:office:office" xmlns:v="urn:schemas-microsoft-com:vml" xmlns:w10="urn:schemas-microsoft-com:office:word" xmlns:a="http://schemas.openxmlformats.org/drawingml/2006/main" xmlns:pic="http://schemas.openxmlformats.org/drawingml/2006/picture" xmlns:wp="http://schemas.openxmlformats.org/drawingml/2006/wordprocessingDrawing">
   <w:body>
-    <w:bookmarkStart w:id="38" w:name="Xc95c947affe0efd86dca169b5de2b1aa38be114"/>
+    <w:bookmarkStart w:id="38" w:name="X467c2580aa475fbe535a1cd8e70fbdf937b9e26"/>
     <w:p>
       <w:pPr>
         <w:pStyle w:val="Title"/>
@@ -10,7 +10,7 @@
         <w:jc w:val="left"/>
       </w:pPr>
       <w:r>
-        <w:t xml:space="preserve">WRRA-M 0.5: Quantized Mass and Continuous Gravity in a Finite Twist Model</w:t>
+        <w:t xml:space="preserve">WRRA M 0 5 Information Load and Twist Gravity in a Finite Model</w:t>
       </w:r>
     </w:p>
     <w:p>
@@ -1044,7 +1044,7 @@
         <w:jc w:val="left"/>
       </w:pPr>
       <w:r>
-        <w:t xml:space="preserve">The approximately 5% phenotype fraction and approximately 95% remaining before phenotype are editable energy-weighted calibrations. They are not measured fractions of information bits or channel counts. With the present inputs f_Φ = 0.0493 and clustering-stress fraction f_T = 0.265, the entire remaining fraction is 0.9507 and the residual background account is 0.6857. That background account is not identified as a microscopic derivation of a separate dark-energy cause. The executed calculation focuses on the local additional-attraction sector represented by f_T.</w:t>
+        <w:t xml:space="preserve">The approximately 5% phenotype fraction and approximately 95% remaining before phenotype are editable energy-weighted calibrations. They are not measured fractions of information bits or channel counts. With the present inputs f_Φ = 0.0493 and clustering-stress fraction f_T = 0.265, the entire remaining fraction is 0.9507 and the residual background account is 0.6857. That background account is not identified as a microscopic derivation of a separate dark-energy cause. The executed calculation focuses on the local additional-attraction sector represented by f_T. The rotation and lensing outputs therefore evaluate the clustering-stress sector corresponding to about 26.5% of the total, within the whole hidden sector of about 95%; they do not calculate the gravity and expansion of that entire hidden sector.</w:t>
       </w:r>
     </w:p>
     <w:p>
@@ -1391,7 +1391,7 @@
         <w:jc w:val="left"/>
       </w:pPr>
       <w:r>
-        <w:t xml:space="preserve">The model weights w_a convert information states into an energy load. Once this transformation is fixed, the remaining information content is an input to the twist-rate calculation. At fixed volume and stiffness, κ_tot² is therefore proportional to E_pre. No universal rest mass is assigned to an arbitrary information bit.</w:t>
+        <w:t xml:space="preserve">The model weights w_a convert information states into an energy load. Once this transformation is fixed, the remaining information content is an input to the twist-rate calculation. At fixed volume and stiffness, κ_tot² is therefore proportional to E_pre. No universal rest mass is assigned to an arbitrary information bit. Computing the load from the individual weighted information states and connecting the carrier test to local gravity remain to be implemented.</w:t>
       </w:r>
     </w:p>
     <w:p>
@@ -8002,6 +8002,184 @@
                 <w:sz w:val="20"/>
               </w:rPr>
               <w:t xml:space="preserve">Equation (3)</w:t>
+            </w:r>
+          </w:p>
+        </w:tc>
+      </w:tr>
+      <w:tr>
+        <w:trPr>
+          <w:cantSplit/>
+        </w:trPr>
+        <w:tc>
+          <w:tcPr>
+            <w:tcW w:type="dxa" w:w="3485"/>
+            <w:vAlign w:val="center"/>
+            <w:shd w:fill="F7F8FA"/>
+            <w:tcMar>
+              <w:top w:w="90" w:type="dxa"/>
+              <w:left w:w="90" w:type="dxa"/>
+              <w:bottom w:w="90" w:type="dxa"/>
+              <w:right w:w="90" w:type="dxa"/>
+            </w:tcMar>
+          </w:tcPr>
+          <w:p>
+            <w:pPr>
+              <w:pStyle w:val="Compact"/>
+              <w:spacing w:before="60" w:after="60" w:line="264" w:lineRule="auto"/>
+              <w:jc w:val="left"/>
+            </w:pPr>
+            <w:r>
+              <w:rPr>
+                <w:rFonts w:ascii="Liberation Serif" w:hAnsi="Liberation Serif"/>
+                <w:b w:val="0"/>
+                <w:sz w:val="20"/>
+              </w:rPr>
+              <w:t xml:space="preserve">Information-load to twist transformation</w:t>
+            </w:r>
+          </w:p>
+        </w:tc>
+        <w:tc>
+          <w:tcPr>
+            <w:tcW w:type="dxa" w:w="3024"/>
+            <w:vAlign w:val="center"/>
+            <w:shd w:fill="F7F8FA"/>
+            <w:tcMar>
+              <w:top w:w="90" w:type="dxa"/>
+              <w:left w:w="90" w:type="dxa"/>
+              <w:bottom w:w="90" w:type="dxa"/>
+              <w:right w:w="90" w:type="dxa"/>
+            </w:tcMar>
+          </w:tcPr>
+          <w:p>
+            <w:pPr>
+              <w:pStyle w:val="Compact"/>
+              <w:spacing w:before="60" w:after="60" w:line="264" w:lineRule="auto"/>
+              <w:jc w:val="left"/>
+            </w:pPr>
+            <w:r>
+              <w:rPr>
+                <w:rFonts w:ascii="Liberation Serif" w:hAnsi="Liberation Serif"/>
+                <w:b w:val="0"/>
+                <w:sz w:val="20"/>
+              </w:rPr>
+              <w:t xml:space="preserve">Constitutive hypothesis</w:t>
+            </w:r>
+          </w:p>
+        </w:tc>
+        <w:tc>
+          <w:tcPr>
+            <w:tcW w:type="dxa" w:w="3485"/>
+            <w:vAlign w:val="center"/>
+            <w:shd w:fill="F7F8FA"/>
+            <w:tcMar>
+              <w:top w:w="90" w:type="dxa"/>
+              <w:left w:w="90" w:type="dxa"/>
+              <w:bottom w:w="90" w:type="dxa"/>
+              <w:right w:w="90" w:type="dxa"/>
+            </w:tcMar>
+          </w:tcPr>
+          <w:p>
+            <w:pPr>
+              <w:pStyle w:val="Compact"/>
+              <w:spacing w:before="60" w:after="60" w:line="264" w:lineRule="auto"/>
+              <w:jc w:val="left"/>
+            </w:pPr>
+            <w:r>
+              <w:rPr>
+                <w:rFonts w:ascii="Liberation Serif" w:hAnsi="Liberation Serif"/>
+                <w:b w:val="0"/>
+                <w:sz w:val="20"/>
+              </w:rPr>
+              <w:t xml:space="preserve">Equation (4) and unspecified state weights</w:t>
+            </w:r>
+          </w:p>
+        </w:tc>
+      </w:tr>
+      <w:tr>
+        <w:trPr>
+          <w:cantSplit/>
+        </w:trPr>
+        <w:tc>
+          <w:tcPr>
+            <w:tcW w:type="dxa" w:w="3485"/>
+            <w:vAlign w:val="center"/>
+            <w:shd w:fill="FFFFFF"/>
+            <w:tcMar>
+              <w:top w:w="90" w:type="dxa"/>
+              <w:left w:w="90" w:type="dxa"/>
+              <w:bottom w:w="90" w:type="dxa"/>
+              <w:right w:w="90" w:type="dxa"/>
+            </w:tcMar>
+          </w:tcPr>
+          <w:p>
+            <w:pPr>
+              <w:pStyle w:val="Compact"/>
+              <w:spacing w:before="60" w:after="60" w:line="264" w:lineRule="auto"/>
+              <w:jc w:val="left"/>
+            </w:pPr>
+            <w:r>
+              <w:rPr>
+                <w:rFonts w:ascii="Liberation Serif" w:hAnsi="Liberation Serif"/>
+                <w:b w:val="0"/>
+                <w:sz w:val="20"/>
+              </w:rPr>
+              <w:t xml:space="preserve">Finite boundaryless universe construction</w:t>
+            </w:r>
+          </w:p>
+        </w:tc>
+        <w:tc>
+          <w:tcPr>
+            <w:tcW w:type="dxa" w:w="3024"/>
+            <w:vAlign w:val="center"/>
+            <w:shd w:fill="FFFFFF"/>
+            <w:tcMar>
+              <w:top w:w="90" w:type="dxa"/>
+              <w:left w:w="90" w:type="dxa"/>
+              <w:bottom w:w="90" w:type="dxa"/>
+              <w:right w:w="90" w:type="dxa"/>
+            </w:tcMar>
+          </w:tcPr>
+          <w:p>
+            <w:pPr>
+              <w:pStyle w:val="Compact"/>
+              <w:spacing w:before="60" w:after="60" w:line="264" w:lineRule="auto"/>
+              <w:jc w:val="left"/>
+            </w:pPr>
+            <w:r>
+              <w:rPr>
+                <w:rFonts w:ascii="Liberation Serif" w:hAnsi="Liberation Serif"/>
+                <w:b w:val="0"/>
+                <w:sz w:val="20"/>
+              </w:rPr>
+              <w:t xml:space="preserve">Conditional calculation</w:t>
+            </w:r>
+          </w:p>
+        </w:tc>
+        <w:tc>
+          <w:tcPr>
+            <w:tcW w:type="dxa" w:w="3485"/>
+            <w:vAlign w:val="center"/>
+            <w:shd w:fill="FFFFFF"/>
+            <w:tcMar>
+              <w:top w:w="90" w:type="dxa"/>
+              <w:left w:w="90" w:type="dxa"/>
+              <w:bottom w:w="90" w:type="dxa"/>
+              <w:right w:w="90" w:type="dxa"/>
+            </w:tcMar>
+          </w:tcPr>
+          <w:p>
+            <w:pPr>
+              <w:pStyle w:val="Compact"/>
+              <w:spacing w:before="60" w:after="60" w:line="264" w:lineRule="auto"/>
+              <w:jc w:val="left"/>
+            </w:pPr>
+            <w:r>
+              <w:rPr>
+                <w:rFonts w:ascii="Liberation Serif" w:hAnsi="Liberation Serif"/>
+                <w:b w:val="0"/>
+                <w:sz w:val="20"/>
+              </w:rPr>
+              <w:t xml:space="preserve">Equation (5) in the declared T³ gluing model</w:t>
             </w:r>
           </w:p>
         </w:tc>

</xml_diff>